<commit_message>
Wrote about Intersection related traffic accidents, and started the problem with how complex some modern intersections have become.
</commit_message>
<xml_diff>
--- a/Traffic-Simulator.docx
+++ b/Traffic-Simulator.docx
@@ -8,39 +8,173 @@
       </w:r>
     </w:p>
     <w:p>
+      <w:pPr>
+        <w:pStyle w:val="Heading1"/>
+      </w:pPr>
       <w:r>
         <w:lastRenderedPageBreak/>
-        <w:t>Problem/the why</w:t>
-      </w:r>
-    </w:p>
-    <w:p>
+        <w:t>Problem Statement</w:t>
+      </w:r>
+    </w:p>
+    <w:p>
+      <w:pPr>
+        <w:pStyle w:val="Heading2"/>
+      </w:pPr>
       <w:r>
         <w:t>Problem in the real world</w:t>
       </w:r>
     </w:p>
     <w:p>
       <w:pPr>
+        <w:pStyle w:val="Heading3"/>
+      </w:pPr>
+      <w:r>
+        <w:t>Impact of Traffic Congestion</w:t>
+      </w:r>
+    </w:p>
+    <w:p>
+      <w:r>
+        <w:t xml:space="preserve">Traffic congestion of one of the most widespread </w:t>
+      </w:r>
+      <w:r>
+        <w:t>problems</w:t>
+      </w:r>
+      <w:r>
+        <w:t xml:space="preserve"> in urban life, </w:t>
+      </w:r>
+      <w:r>
+        <w:t>influencing</w:t>
+      </w:r>
+      <w:r>
+        <w:t xml:space="preserve"> city </w:t>
+      </w:r>
+      <w:r>
+        <w:t>residents</w:t>
+      </w:r>
+      <w:r>
+        <w:t xml:space="preserve"> every day. Drivers lose significant </w:t>
+      </w:r>
+      <w:r>
+        <w:t>time</w:t>
+      </w:r>
+      <w:r>
+        <w:t xml:space="preserve"> each year sitting in traffic, burning </w:t>
+      </w:r>
+      <w:r>
+        <w:t>up</w:t>
+      </w:r>
+      <w:r>
+        <w:t xml:space="preserve"> fuel, and contributing to rising air pollution.</w:t>
+      </w:r>
+    </w:p>
+    <w:p>
+      <w:r>
+        <w:t xml:space="preserve">Congestion can also take an economic toll. Congested roads </w:t>
+      </w:r>
+      <w:r>
+        <w:t>lead</w:t>
+      </w:r>
+      <w:r>
+        <w:t xml:space="preserve"> to higher stress and </w:t>
+      </w:r>
+      <w:r>
+        <w:t>frustration</w:t>
+      </w:r>
+      <w:r>
+        <w:t xml:space="preserve">, </w:t>
+      </w:r>
+      <w:r>
+        <w:t>raising</w:t>
+      </w:r>
+      <w:r>
+        <w:t xml:space="preserve"> the </w:t>
+      </w:r>
+      <w:r>
+        <w:t>likelihood</w:t>
+      </w:r>
+      <w:r>
+        <w:t xml:space="preserve"> of accidents, and </w:t>
+      </w:r>
+      <w:r>
+        <w:t>discouraging</w:t>
+      </w:r>
+      <w:r>
+        <w:t xml:space="preserve"> people from traveling altogether. Research</w:t>
+      </w:r>
+      <w:r>
+        <w:t>ers</w:t>
+      </w:r>
+      <w:r>
+        <w:t xml:space="preserve"> </w:t>
+      </w:r>
+      <w:r>
+        <w:t>have</w:t>
+      </w:r>
+      <w:r>
+        <w:t xml:space="preserve"> noted that traffic congestion </w:t>
+      </w:r>
+      <w:r>
+        <w:t>cause</w:t>
+      </w:r>
+      <w:r>
+        <w:t xml:space="preserve"> </w:t>
+      </w:r>
+      <w:r>
+        <w:t>large</w:t>
+      </w:r>
+      <w:r>
+        <w:t xml:space="preserve"> cities </w:t>
+      </w:r>
+      <w:r>
+        <w:t>to deliver</w:t>
+      </w:r>
+      <w:r>
+        <w:t xml:space="preserve"> less </w:t>
+      </w:r>
+      <w:r>
+        <w:t>than</w:t>
+      </w:r>
+      <w:r>
+        <w:t xml:space="preserve"> they should give</w:t>
+      </w:r>
+      <w:r>
+        <w:t>n</w:t>
+      </w:r>
+      <w:r>
+        <w:t xml:space="preserve"> their size and resources </w:t>
+      </w:r>
+      <w:r>
+        <w:t>(</w:t>
+      </w:r>
+      <w:r>
+        <w:t>Andrew</w:t>
+      </w:r>
+      <w:r>
+        <w:t>, 2025)</w:t>
+      </w:r>
+      <w:r>
+        <w:t>.</w:t>
+      </w:r>
+    </w:p>
+    <w:p/>
+    <w:p>
+      <w:pPr>
+        <w:pStyle w:val="Heading3"/>
+      </w:pPr>
+      <w:r>
+        <w:t>Traffic Accidents Related to Intersections</w:t>
+      </w:r>
+    </w:p>
+    <w:p/>
+    <w:p>
+      <w:pPr>
         <w:pStyle w:val="ListParagraph"/>
-        <w:numPr>
-          <w:ilvl w:val="0"/>
-          <w:numId w:val="1"/>
-        </w:numPr>
-      </w:pPr>
-      <w:r>
-        <w:t>Traffic congestion effects (economic, environmental)</w:t>
-      </w:r>
+      </w:pPr>
     </w:p>
     <w:p>
       <w:pPr>
         <w:pStyle w:val="ListParagraph"/>
-        <w:numPr>
-          <w:ilvl w:val="0"/>
-          <w:numId w:val="1"/>
-        </w:numPr>
-      </w:pPr>
-      <w:r>
-        <w:t>Accidents related to intersections</w:t>
-      </w:r>
+      </w:pPr>
     </w:p>
     <w:p>
       <w:pPr>
@@ -156,8 +290,8 @@
   <w:abstractNum w:abstractNumId="0" w15:restartNumberingAfterBreak="0">
     <w:nsid w:val="1F4128A9"/>
     <w:multiLevelType w:val="hybridMultilevel"/>
-    <w:tmpl w:val="94F4BFDE"/>
-    <w:lvl w:ilvl="0" w:tplc="0804F318">
+    <w:tmpl w:val="7070E57A"/>
+    <w:lvl w:ilvl="0" w:tplc="3328DCC8">
       <w:numFmt w:val="bullet"/>
       <w:lvlText w:val="-"/>
       <w:lvlJc w:val="left"/>
@@ -679,7 +813,7 @@
     <w:link w:val="Heading1Char"/>
     <w:uiPriority w:val="9"/>
     <w:qFormat/>
-    <w:rsid w:val="007A55E8"/>
+    <w:rsid w:val="00AE6F64"/>
     <w:pPr>
       <w:keepNext/>
       <w:keepLines/>
@@ -688,8 +822,9 @@
     </w:pPr>
     <w:rPr>
       <w:rFonts w:asciiTheme="majorHAnsi" w:eastAsiaTheme="majorEastAsia" w:hAnsiTheme="majorHAnsi" w:cstheme="majorBidi"/>
-      <w:color w:val="0F4761" w:themeColor="accent1" w:themeShade="BF"/>
-      <w:sz w:val="40"/>
+      <w:b/>
+      <w:color w:val="000000" w:themeColor="text1"/>
+      <w:sz w:val="32"/>
       <w:szCs w:val="40"/>
     </w:rPr>
   </w:style>
@@ -699,10 +834,9 @@
     <w:next w:val="Normal"/>
     <w:link w:val="Heading2Char"/>
     <w:uiPriority w:val="9"/>
-    <w:semiHidden/>
     <w:unhideWhenUsed/>
     <w:qFormat/>
-    <w:rsid w:val="007A55E8"/>
+    <w:rsid w:val="00AE6F64"/>
     <w:pPr>
       <w:keepNext/>
       <w:keepLines/>
@@ -711,8 +845,9 @@
     </w:pPr>
     <w:rPr>
       <w:rFonts w:asciiTheme="majorHAnsi" w:eastAsiaTheme="majorEastAsia" w:hAnsiTheme="majorHAnsi" w:cstheme="majorBidi"/>
-      <w:color w:val="0F4761" w:themeColor="accent1" w:themeShade="BF"/>
-      <w:sz w:val="32"/>
+      <w:b/>
+      <w:color w:val="000000" w:themeColor="text1"/>
+      <w:sz w:val="28"/>
       <w:szCs w:val="32"/>
     </w:rPr>
   </w:style>
@@ -722,10 +857,9 @@
     <w:next w:val="Normal"/>
     <w:link w:val="Heading3Char"/>
     <w:uiPriority w:val="9"/>
-    <w:semiHidden/>
     <w:unhideWhenUsed/>
     <w:qFormat/>
-    <w:rsid w:val="007A55E8"/>
+    <w:rsid w:val="00525016"/>
     <w:pPr>
       <w:keepNext/>
       <w:keepLines/>
@@ -734,8 +868,8 @@
     </w:pPr>
     <w:rPr>
       <w:rFonts w:eastAsiaTheme="majorEastAsia" w:cstheme="majorBidi"/>
-      <w:color w:val="0F4761" w:themeColor="accent1" w:themeShade="BF"/>
-      <w:sz w:val="28"/>
+      <w:b/>
+      <w:color w:val="000000" w:themeColor="text1"/>
       <w:szCs w:val="28"/>
     </w:rPr>
   </w:style>
@@ -874,7 +1008,6 @@
   <w:style w:type="character" w:default="1" w:styleId="DefaultParagraphFont">
     <w:name w:val="Default Paragraph Font"/>
     <w:uiPriority w:val="1"/>
-    <w:semiHidden/>
     <w:unhideWhenUsed/>
   </w:style>
   <w:style w:type="table" w:default="1" w:styleId="TableNormal">
@@ -903,11 +1036,12 @@
     <w:basedOn w:val="DefaultParagraphFont"/>
     <w:link w:val="Heading1"/>
     <w:uiPriority w:val="9"/>
-    <w:rsid w:val="007A55E8"/>
+    <w:rsid w:val="00AE6F64"/>
     <w:rPr>
       <w:rFonts w:asciiTheme="majorHAnsi" w:eastAsiaTheme="majorEastAsia" w:hAnsiTheme="majorHAnsi" w:cstheme="majorBidi"/>
-      <w:color w:val="0F4761" w:themeColor="accent1" w:themeShade="BF"/>
-      <w:sz w:val="40"/>
+      <w:b/>
+      <w:color w:val="000000" w:themeColor="text1"/>
+      <w:sz w:val="32"/>
       <w:szCs w:val="40"/>
     </w:rPr>
   </w:style>
@@ -916,12 +1050,12 @@
     <w:basedOn w:val="DefaultParagraphFont"/>
     <w:link w:val="Heading2"/>
     <w:uiPriority w:val="9"/>
-    <w:semiHidden/>
-    <w:rsid w:val="007A55E8"/>
+    <w:rsid w:val="00AE6F64"/>
     <w:rPr>
       <w:rFonts w:asciiTheme="majorHAnsi" w:eastAsiaTheme="majorEastAsia" w:hAnsiTheme="majorHAnsi" w:cstheme="majorBidi"/>
-      <w:color w:val="0F4761" w:themeColor="accent1" w:themeShade="BF"/>
-      <w:sz w:val="32"/>
+      <w:b/>
+      <w:color w:val="000000" w:themeColor="text1"/>
+      <w:sz w:val="28"/>
       <w:szCs w:val="32"/>
     </w:rPr>
   </w:style>
@@ -930,12 +1064,11 @@
     <w:basedOn w:val="DefaultParagraphFont"/>
     <w:link w:val="Heading3"/>
     <w:uiPriority w:val="9"/>
-    <w:semiHidden/>
-    <w:rsid w:val="007A55E8"/>
+    <w:rsid w:val="00525016"/>
     <w:rPr>
       <w:rFonts w:eastAsiaTheme="majorEastAsia" w:cstheme="majorBidi"/>
-      <w:color w:val="0F4761" w:themeColor="accent1" w:themeShade="BF"/>
-      <w:sz w:val="28"/>
+      <w:b/>
+      <w:color w:val="000000" w:themeColor="text1"/>
       <w:szCs w:val="28"/>
     </w:rPr>
   </w:style>
@@ -1484,4 +1617,16 @@
     </a:ext>
   </a:extLst>
 </a:theme>
+</file>
+
+<file path=customXml/item1.xml><?xml version="1.0" encoding="utf-8"?>
+<b:Sources xmlns:b="http://schemas.openxmlformats.org/officeDocument/2006/bibliography" xmlns="http://schemas.openxmlformats.org/officeDocument/2006/bibliography" SelectedStyle="\APASixthEditionOfficeOnline.xsl" StyleName="APA" Version="6"/>
+</file>
+
+<file path=customXml/itemProps1.xml><?xml version="1.0" encoding="utf-8"?>
+<ds:datastoreItem xmlns:ds="http://schemas.openxmlformats.org/officeDocument/2006/customXml" ds:itemID="{F9B3165F-DEB3-491A-9812-ED3605334CFB}">
+  <ds:schemaRefs>
+    <ds:schemaRef ds:uri="http://schemas.openxmlformats.org/officeDocument/2006/bibliography"/>
+  </ds:schemaRefs>
+</ds:datastoreItem>
 </file>
</xml_diff>

<commit_message>
Added title page using APA format, may change at a later time.
</commit_message>
<xml_diff>
--- a/Traffic-Simulator.docx
+++ b/Traffic-Simulator.docx
@@ -3,15 +3,115 @@
 <w:document xmlns:wpc="http://schemas.microsoft.com/office/word/2010/wordprocessingCanvas" xmlns:cx="http://schemas.microsoft.com/office/drawing/2014/chartex" xmlns:cx1="http://schemas.microsoft.com/office/drawing/2015/9/8/chartex" xmlns:cx2="http://schemas.microsoft.com/office/drawing/2015/10/21/chartex" xmlns:cx3="http://schemas.microsoft.com/office/drawing/2016/5/9/chartex" xmlns:cx4="http://schemas.microsoft.com/office/drawing/2016/5/10/chartex" xmlns:cx5="http://schemas.microsoft.com/office/drawing/2016/5/11/chartex" xmlns:cx6="http://schemas.microsoft.com/office/drawing/2016/5/12/chartex" xmlns:cx7="http://schemas.microsoft.com/office/drawing/2016/5/13/chartex" xmlns:cx8="http://schemas.microsoft.com/office/drawing/2016/5/14/chartex" xmlns:mc="http://schemas.openxmlformats.org/markup-compatibility/2006" xmlns:aink="http://schemas.microsoft.com/office/drawing/2016/ink" xmlns:am3d="http://schemas.microsoft.com/office/drawing/2017/model3d" xmlns:o="urn:schemas-microsoft-com:office:office" xmlns:oel="http://schemas.microsoft.com/office/2019/extlst" xmlns:r="http://schemas.openxmlformats.org/officeDocument/2006/relationships" xmlns:m="http://schemas.openxmlformats.org/officeDocument/2006/math" xmlns:v="urn:schemas-microsoft-com:vml" xmlns:wp14="http://schemas.microsoft.com/office/word/2010/wordprocessingDrawing" xmlns:wp="http://schemas.openxmlformats.org/drawingml/2006/wordprocessingDrawing" xmlns:w10="urn:schemas-microsoft-com:office:word" xmlns:w="http://schemas.openxmlformats.org/wordprocessingml/2006/main" xmlns:w14="http://schemas.microsoft.com/office/word/2010/wordml" xmlns:w15="http://schemas.microsoft.com/office/word/2012/wordml" xmlns:w16cex="http://schemas.microsoft.com/office/word/2018/wordml/cex" xmlns:w16cid="http://schemas.microsoft.com/office/word/2016/wordml/cid" xmlns:w16="http://schemas.microsoft.com/office/word/2018/wordml" xmlns:w16du="http://schemas.microsoft.com/office/word/2023/wordml/word16du" xmlns:w16sdtdh="http://schemas.microsoft.com/office/word/2020/wordml/sdtdatahash" xmlns:w16sdtfl="http://schemas.microsoft.com/office/word/2024/wordml/sdtformatlock" xmlns:w16se="http://schemas.microsoft.com/office/word/2015/wordml/symex" xmlns:wpg="http://schemas.microsoft.com/office/word/2010/wordprocessingGroup" xmlns:wpi="http://schemas.microsoft.com/office/word/2010/wordprocessingInk" xmlns:wne="http://schemas.microsoft.com/office/word/2006/wordml" xmlns:wps="http://schemas.microsoft.com/office/word/2010/wordprocessingShape" mc:Ignorable="w14 w15 w16se w16cid w16 w16cex w16sdtdh w16sdtfl w16du wp14">
   <w:body>
     <w:p>
-      <w:r>
+      <w:pPr>
+        <w:pStyle w:val="Heading1"/>
+        <w:jc w:val="center"/>
+        <w:rPr>
+          <w:sz w:val="56"/>
+          <w:szCs w:val="56"/>
+        </w:rPr>
+      </w:pPr>
+    </w:p>
+    <w:p/>
+    <w:p/>
+    <w:p>
+      <w:pPr>
+        <w:pStyle w:val="Title"/>
+      </w:pPr>
+      <w:r>
+        <w:t>Team Gala Junior Project Proposal – Traffic Control Simulator</w:t>
+      </w:r>
+    </w:p>
+    <w:p>
+      <w:pPr>
+        <w:pStyle w:val="Heading1"/>
+        <w:jc w:val="center"/>
+        <w:rPr>
+          <w:rFonts w:asciiTheme="minorHAnsi" w:hAnsiTheme="minorHAnsi"/>
+          <w:b w:val="0"/>
+          <w:bCs/>
+          <w:sz w:val="24"/>
+          <w:szCs w:val="24"/>
+        </w:rPr>
+      </w:pPr>
+    </w:p>
+    <w:p/>
+    <w:p>
+      <w:pPr>
+        <w:pStyle w:val="Heading1"/>
+        <w:jc w:val="center"/>
+        <w:rPr>
+          <w:rFonts w:asciiTheme="minorHAnsi" w:hAnsiTheme="minorHAnsi"/>
+          <w:b w:val="0"/>
+          <w:bCs/>
+          <w:sz w:val="24"/>
+          <w:szCs w:val="24"/>
+        </w:rPr>
+      </w:pPr>
+      <w:r>
+        <w:rPr>
+          <w:rFonts w:asciiTheme="minorHAnsi" w:hAnsiTheme="minorHAnsi"/>
+          <w:b w:val="0"/>
+          <w:bCs/>
+          <w:sz w:val="24"/>
+          <w:szCs w:val="24"/>
+        </w:rPr>
+        <w:t>Zane Dollarhide, Carson Page, Caden Palomares, Andrew Saigo</w:t>
+      </w:r>
+    </w:p>
+    <w:p>
+      <w:pPr>
+        <w:jc w:val="center"/>
+      </w:pPr>
+      <w:r>
+        <w:t>Computer Systems Engineering Technology Department</w:t>
+      </w:r>
+    </w:p>
+    <w:p>
+      <w:pPr>
+        <w:jc w:val="center"/>
+      </w:pPr>
+      <w:r>
+        <w:t>CST 316: Junior Project</w:t>
+      </w:r>
+    </w:p>
+    <w:p>
+      <w:pPr>
+        <w:jc w:val="center"/>
+      </w:pPr>
+      <w:r>
+        <w:t>Todd Breedlove</w:t>
+      </w:r>
+    </w:p>
+    <w:p>
+      <w:pPr>
+        <w:jc w:val="center"/>
+      </w:pPr>
+      <w:r>
+        <w:t>October 22, 2026</w:t>
+      </w:r>
+    </w:p>
+    <w:p>
+      <w:pPr>
+        <w:pStyle w:val="Heading1"/>
+        <w:jc w:val="center"/>
+        <w:rPr>
+          <w:sz w:val="56"/>
+          <w:szCs w:val="56"/>
+        </w:rPr>
+      </w:pPr>
+      <w:r>
+        <w:rPr>
+          <w:sz w:val="56"/>
+          <w:szCs w:val="56"/>
+        </w:rPr>
         <w:br w:type="page"/>
       </w:r>
-    </w:p>
-    <w:p>
-      <w:pPr>
-        <w:pStyle w:val="Heading1"/>
-      </w:pPr>
-      <w:r>
+      <w:r>
+        <w:rPr>
+          <w:sz w:val="56"/>
+          <w:szCs w:val="56"/>
+        </w:rPr>
         <w:lastRenderedPageBreak/>
         <w:t>Problem Statement</w:t>
       </w:r>
@@ -67,6 +167,7 @@
         <w:t xml:space="preserve"> fuel, and contributing to rising air pollution.</w:t>
       </w:r>
     </w:p>
+    <w:p/>
     <w:p>
       <w:r>
         <w:t xml:space="preserve">Congestion can also take an economic toll. Congested roads </w:t>
@@ -144,50 +245,120 @@
         <w:t xml:space="preserve"> their size and resources </w:t>
       </w:r>
       <w:r>
+        <w:t>(Andrew, 2025)</w:t>
+      </w:r>
+      <w:r>
+        <w:t>.</w:t>
+      </w:r>
+    </w:p>
+    <w:p/>
+    <w:p>
+      <w:pPr>
+        <w:pStyle w:val="Heading3"/>
+      </w:pPr>
+      <w:r>
+        <w:t>Traffic Accidents Related to Intersections</w:t>
+      </w:r>
+    </w:p>
+    <w:p>
+      <w:r>
+        <w:t>Intersections</w:t>
+      </w:r>
+      <w:r>
+        <w:t xml:space="preserve"> are one of the most </w:t>
+      </w:r>
+      <w:r>
+        <w:t>dangerous</w:t>
+      </w:r>
+      <w:r>
+        <w:t xml:space="preserve"> points in any </w:t>
+      </w:r>
+      <w:r>
+        <w:t>road network</w:t>
+      </w:r>
+      <w:r>
+        <w:t xml:space="preserve">. </w:t>
+      </w:r>
+      <w:r>
+        <w:t xml:space="preserve">Traffic fatalities involving an intersection took up 28% of all traffic fatalities in 2022 </w:t>
+      </w:r>
+      <w:r>
+        <w:t>(Federal Highway Administration, 2</w:t>
+      </w:r>
+      <w:r>
+        <w:t xml:space="preserve">026). </w:t>
+      </w:r>
+      <w:r>
+        <w:t xml:space="preserve">Four-way </w:t>
+      </w:r>
+      <w:r>
+        <w:t>intersections</w:t>
+      </w:r>
+      <w:r>
+        <w:t xml:space="preserve"> are the most common place for deadly </w:t>
+      </w:r>
+      <w:r>
+        <w:t>collisions</w:t>
+      </w:r>
+      <w:r>
+        <w:t xml:space="preserve">, accounting for nearly 62% of all intersection related fatal crashes, this goes beyond drivers, 26% of pedestrian fatalities and 40% of cyclist </w:t>
+      </w:r>
+      <w:r>
+        <w:t>fatalities</w:t>
+      </w:r>
+      <w:r>
+        <w:t xml:space="preserve"> in 2018 happened at intersections.</w:t>
+      </w:r>
+    </w:p>
+    <w:p/>
+    <w:p>
+      <w:r>
+        <w:t>Intersection design has a direct impact on public safety. Signal time, lane configuration, and turn sequences are all part of a system that determines when and if people go home. A simulation tool that allows engineers to test these design choices before construction would play a role in reducing these statistics.</w:t>
+      </w:r>
+    </w:p>
+    <w:p/>
+    <w:p>
+      <w:pPr>
+        <w:pStyle w:val="Heading3"/>
+      </w:pPr>
+      <w:r>
+        <w:t>Complexity of Modern Intersections</w:t>
+      </w:r>
+    </w:p>
+    <w:p>
+      <w:r>
+        <w:t>Infrastructure has vastly changed to accommodate dense population and destinations. Modern intersections are hardly uniform, varying in geometry, visibility, and traffic density.</w:t>
+      </w:r>
+      <w:r>
+        <w:t xml:space="preserve"> </w:t>
+      </w:r>
+      <w:r>
+        <w:t xml:space="preserve">Traffic complexity is measured by combing static geometry such as number of approach legs, road width, sight distance, and presence of islands or medians. With dynamic </w:t>
+      </w:r>
+      <w:r>
+        <w:lastRenderedPageBreak/>
+        <w:t xml:space="preserve">environments such as traffic volume, pedestrian crossing, and bicycle lanes. </w:t>
+      </w:r>
+      <w:r>
+        <w:t xml:space="preserve">More complexity of intersections has shown an increase in the mental workload of </w:t>
+      </w:r>
+      <w:r>
+        <w:t xml:space="preserve">drivers </w:t>
+      </w:r>
+      <w:r>
         <w:t>(</w:t>
       </w:r>
       <w:r>
-        <w:t>Andrew</w:t>
-      </w:r>
-      <w:r>
-        <w:t>, 2025)</w:t>
+        <w:t>Hannes Weinreuter et al., 2022)</w:t>
       </w:r>
       <w:r>
         <w:t>.</w:t>
       </w:r>
+      <w:r>
+        <w:t xml:space="preserve"> </w:t>
+      </w:r>
     </w:p>
     <w:p/>
-    <w:p>
-      <w:pPr>
-        <w:pStyle w:val="Heading3"/>
-      </w:pPr>
-      <w:r>
-        <w:t>Traffic Accidents Related to Intersections</w:t>
-      </w:r>
-    </w:p>
-    <w:p/>
-    <w:p>
-      <w:pPr>
-        <w:pStyle w:val="ListParagraph"/>
-      </w:pPr>
-    </w:p>
-    <w:p>
-      <w:pPr>
-        <w:pStyle w:val="ListParagraph"/>
-      </w:pPr>
-    </w:p>
-    <w:p>
-      <w:pPr>
-        <w:pStyle w:val="ListParagraph"/>
-        <w:numPr>
-          <w:ilvl w:val="0"/>
-          <w:numId w:val="1"/>
-        </w:numPr>
-      </w:pPr>
-      <w:r>
-        <w:t>Complexity of modern intersections</w:t>
-      </w:r>
-    </w:p>
     <w:p>
       <w:r>
         <w:t>Modern tools with flaws</w:t>
@@ -1008,6 +1179,7 @@
   <w:style w:type="character" w:default="1" w:styleId="DefaultParagraphFont">
     <w:name w:val="Default Paragraph Font"/>
     <w:uiPriority w:val="1"/>
+    <w:semiHidden/>
     <w:unhideWhenUsed/>
   </w:style>
   <w:style w:type="table" w:default="1" w:styleId="TableNormal">
@@ -1157,13 +1329,15 @@
     <w:link w:val="TitleChar"/>
     <w:uiPriority w:val="10"/>
     <w:qFormat/>
-    <w:rsid w:val="007A55E8"/>
+    <w:rsid w:val="0063240B"/>
     <w:pPr>
       <w:spacing w:after="80" w:line="240" w:lineRule="auto"/>
       <w:contextualSpacing/>
+      <w:jc w:val="center"/>
     </w:pPr>
     <w:rPr>
       <w:rFonts w:asciiTheme="majorHAnsi" w:eastAsiaTheme="majorEastAsia" w:hAnsiTheme="majorHAnsi" w:cstheme="majorBidi"/>
+      <w:b/>
       <w:spacing w:val="-10"/>
       <w:kern w:val="28"/>
       <w:sz w:val="56"/>
@@ -1175,9 +1349,10 @@
     <w:basedOn w:val="DefaultParagraphFont"/>
     <w:link w:val="Title"/>
     <w:uiPriority w:val="10"/>
-    <w:rsid w:val="007A55E8"/>
+    <w:rsid w:val="0063240B"/>
     <w:rPr>
       <w:rFonts w:asciiTheme="majorHAnsi" w:eastAsiaTheme="majorEastAsia" w:hAnsiTheme="majorHAnsi" w:cstheme="majorBidi"/>
+      <w:b/>
       <w:spacing w:val="-10"/>
       <w:kern w:val="28"/>
       <w:sz w:val="56"/>

</xml_diff>

<commit_message>
Added links for refernces, will format later.
</commit_message>
<xml_diff>
--- a/Traffic-Simulator.docx
+++ b/Traffic-Simulator.docx
@@ -426,6 +426,62 @@
         <w:t>Results understood by engineers and businessmen</w:t>
       </w:r>
     </w:p>
+    <w:p>
+      <w:pPr>
+        <w:pStyle w:val="ListParagraph"/>
+      </w:pPr>
+    </w:p>
+    <w:p>
+      <w:pPr>
+        <w:pStyle w:val="ListParagraph"/>
+      </w:pPr>
+    </w:p>
+    <w:p>
+      <w:pPr>
+        <w:pStyle w:val="Heading1"/>
+      </w:pPr>
+      <w:r>
+        <w:t>References</w:t>
+      </w:r>
+    </w:p>
+    <w:p/>
+    <w:p>
+      <w:hyperlink r:id="rId6" w:history="1">
+        <w:r>
+          <w:rPr>
+            <w:rStyle w:val="Hyperlink"/>
+          </w:rPr>
+          <w:t>https://its.ucla.edu/news/for-the-press/traffic-congestion/</w:t>
+        </w:r>
+      </w:hyperlink>
+    </w:p>
+    <w:p>
+      <w:hyperlink r:id="rId7" w:history="1">
+        <w:r>
+          <w:rPr>
+            <w:rStyle w:val="Hyperlink"/>
+          </w:rPr>
+          <w:t>https://highways.dot.gov/safety/intersection-safety/about</w:t>
+        </w:r>
+        <w:r>
+          <w:rPr>
+            <w:rStyle w:val="Hyperlink"/>
+          </w:rPr>
+          <w:t>\</w:t>
+        </w:r>
+      </w:hyperlink>
+    </w:p>
+    <w:p>
+      <w:hyperlink r:id="rId8" w:history="1">
+        <w:r>
+          <w:rPr>
+            <w:rStyle w:val="Hyperlink"/>
+          </w:rPr>
+          <w:t>https://ieeexplore.ieee.org/stamp/stamp.jsp?tp=&amp;arnumber=9817099</w:t>
+        </w:r>
+      </w:hyperlink>
+    </w:p>
+    <w:p/>
     <w:sectPr>
       <w:pgSz w:w="12240" w:h="15840"/>
       <w:pgMar w:top="1440" w:right="1440" w:bottom="1440" w:left="1440" w:header="720" w:footer="720" w:gutter="0"/>
@@ -1477,6 +1533,29 @@
       <w:spacing w:val="5"/>
     </w:rPr>
   </w:style>
+  <w:style w:type="character" w:styleId="Hyperlink">
+    <w:name w:val="Hyperlink"/>
+    <w:basedOn w:val="DefaultParagraphFont"/>
+    <w:uiPriority w:val="99"/>
+    <w:unhideWhenUsed/>
+    <w:rsid w:val="00DB748E"/>
+    <w:rPr>
+      <w:color w:val="467886" w:themeColor="hyperlink"/>
+      <w:u w:val="single"/>
+    </w:rPr>
+  </w:style>
+  <w:style w:type="character" w:styleId="UnresolvedMention">
+    <w:name w:val="Unresolved Mention"/>
+    <w:basedOn w:val="DefaultParagraphFont"/>
+    <w:uiPriority w:val="99"/>
+    <w:semiHidden/>
+    <w:unhideWhenUsed/>
+    <w:rsid w:val="00DB748E"/>
+    <w:rPr>
+      <w:color w:val="605E5C"/>
+      <w:shd w:val="clear" w:color="auto" w:fill="E1DFDD"/>
+    </w:rPr>
+  </w:style>
 </w:styles>
 </file>
 

</xml_diff>

<commit_message>
Made the changes that were established in merge, altered title and changed headings.
</commit_message>
<xml_diff>
--- a/Traffic-Simulator.docx
+++ b/Traffic-Simulator.docx
@@ -382,13 +382,8 @@
     </w:p>
     <w:p>
       <w:r>
-        <w:t xml:space="preserve">The </w:t>
-      </w:r>
-      <w:proofErr w:type="gramStart"/>
-      <w:r>
-        <w:t>who</w:t>
-      </w:r>
-      <w:proofErr w:type="gramEnd"/>
+        <w:t>The who</w:t>
+      </w:r>
     </w:p>
     <w:p>
       <w:pPr>
@@ -444,7 +439,11 @@
         <w:t>References</w:t>
       </w:r>
     </w:p>
-    <w:p/>
+    <w:p>
+      <w:r>
+        <w:t>123</w:t>
+      </w:r>
+    </w:p>
     <w:p>
       <w:hyperlink r:id="rId6" w:history="1">
         <w:r>
@@ -461,13 +460,7 @@
           <w:rPr>
             <w:rStyle w:val="Hyperlink"/>
           </w:rPr>
-          <w:t>https://highways.dot.gov/safety/intersection-safety/about</w:t>
-        </w:r>
-        <w:r>
-          <w:rPr>
-            <w:rStyle w:val="Hyperlink"/>
-          </w:rPr>
-          <w:t>\</w:t>
+          <w:t>https://highways.dot.gov/safety/intersection-safety/about\</w:t>
         </w:r>
       </w:hyperlink>
     </w:p>

</xml_diff>

<commit_message>
Extreme rough draft written for the section writing about modern tools
</commit_message>
<xml_diff>
--- a/Traffic-Simulator.docx
+++ b/Traffic-Simulator.docx
@@ -6,7 +6,11 @@
       <w:pPr>
         <w:pStyle w:val="Heading1"/>
       </w:pPr>
-    </w:p>
+      <w:bookmarkStart w:id="0" w:name="_Toc243679925"/>
+    </w:p>
+    <w:p/>
+    <w:p/>
+    <w:p/>
     <w:p/>
     <w:p/>
     <w:p/>
@@ -33,316 +37,287 @@
     <w:p/>
     <w:p/>
     <w:p/>
+    <w:p/>
+    <w:p/>
+    <w:p>
+      <w:pPr>
+        <w:jc w:val="center"/>
+        <w:rPr>
+          <w:b/>
+        </w:rPr>
+      </w:pPr>
+      <w:bookmarkStart w:id="1" w:name="_Toc243679455"/>
+      <w:r>
+        <w:t>Zane Dollarhide, Carson Page, Caden Palomares, Andrew Saigo</w:t>
+      </w:r>
+      <w:bookmarkEnd w:id="1"/>
+    </w:p>
+    <w:p>
+      <w:pPr>
+        <w:jc w:val="center"/>
+      </w:pPr>
+      <w:r>
+        <w:t>Computer Systems Engineering Technology Department</w:t>
+      </w:r>
+    </w:p>
+    <w:p>
+      <w:pPr>
+        <w:jc w:val="center"/>
+      </w:pPr>
+      <w:r>
+        <w:t>CST 316: Junior Project</w:t>
+      </w:r>
+    </w:p>
+    <w:p>
+      <w:pPr>
+        <w:jc w:val="center"/>
+      </w:pPr>
+      <w:r>
+        <w:t>Todd Breedlove</w:t>
+      </w:r>
+    </w:p>
+    <w:p>
+      <w:pPr>
+        <w:jc w:val="center"/>
+      </w:pPr>
+      <w:r>
+        <w:t>October 22, 2026</w:t>
+      </w:r>
+    </w:p>
+    <w:p>
+      <w:r>
+        <w:br w:type="page"/>
+      </w:r>
+    </w:p>
     <w:p>
       <w:pPr>
         <w:pStyle w:val="Heading1"/>
-        <w:rPr>
-          <w:rFonts w:asciiTheme="minorHAnsi" w:hAnsiTheme="minorHAnsi"/>
-          <w:b w:val="0"/>
-          <w:bCs/>
-          <w:sz w:val="24"/>
-          <w:szCs w:val="24"/>
-        </w:rPr>
-      </w:pPr>
-      <w:r>
-        <w:rPr>
-          <w:rFonts w:asciiTheme="minorHAnsi" w:hAnsiTheme="minorHAnsi"/>
-          <w:b w:val="0"/>
-          <w:bCs/>
-          <w:sz w:val="24"/>
-          <w:szCs w:val="24"/>
-        </w:rPr>
-        <w:t>Zane Dollarhide, Carson Page, Caden Palomares, Andrew Saigo</w:t>
-      </w:r>
-    </w:p>
-    <w:p>
-      <w:pPr>
-        <w:jc w:val="center"/>
-      </w:pPr>
-      <w:r>
-        <w:t>Computer Systems Engineering Technology Department</w:t>
-      </w:r>
-    </w:p>
-    <w:p>
-      <w:pPr>
-        <w:jc w:val="center"/>
-      </w:pPr>
-      <w:r>
-        <w:t>CST 316: Junior Project</w:t>
-      </w:r>
-    </w:p>
-    <w:p>
-      <w:pPr>
-        <w:jc w:val="center"/>
-      </w:pPr>
-      <w:r>
-        <w:t>Todd Breedlove</w:t>
-      </w:r>
-    </w:p>
-    <w:p>
-      <w:pPr>
-        <w:jc w:val="center"/>
-      </w:pPr>
-      <w:r>
-        <w:t>October 22, 2026</w:t>
-      </w:r>
-    </w:p>
-    <w:p>
-      <w:pPr>
-        <w:pStyle w:val="Heading1"/>
-      </w:pPr>
-      <w:r>
-        <w:br w:type="page"/>
-      </w:r>
+        <w:jc w:val="left"/>
+      </w:pPr>
       <w:r>
         <w:lastRenderedPageBreak/>
         <w:t>Problem Statement</w:t>
       </w:r>
+      <w:bookmarkEnd w:id="0"/>
     </w:p>
     <w:p>
       <w:pPr>
         <w:pStyle w:val="Heading2"/>
       </w:pPr>
-      <w:r>
-        <w:t>Problem in the real world</w:t>
-      </w:r>
-    </w:p>
-    <w:p>
-      <w:pPr>
-        <w:pStyle w:val="Heading3"/>
-      </w:pPr>
-      <w:r>
-        <w:t>Impact of Traffic Congestion</w:t>
-      </w:r>
-    </w:p>
-    <w:p>
-      <w:r>
-        <w:t xml:space="preserve">Traffic congestion of one of the most widespread </w:t>
-      </w:r>
-      <w:r>
-        <w:t>problems</w:t>
-      </w:r>
-      <w:r>
-        <w:t xml:space="preserve"> in urban life, </w:t>
-      </w:r>
-      <w:r>
-        <w:t>influencing</w:t>
-      </w:r>
-      <w:r>
-        <w:t xml:space="preserve"> city </w:t>
-      </w:r>
-      <w:r>
-        <w:t>residents</w:t>
-      </w:r>
-      <w:r>
-        <w:t xml:space="preserve"> every day. Drivers lose significant </w:t>
-      </w:r>
-      <w:r>
-        <w:t>time</w:t>
-      </w:r>
-      <w:r>
-        <w:t xml:space="preserve"> each year sitting in traffic, burning </w:t>
-      </w:r>
-      <w:r>
-        <w:t>up</w:t>
-      </w:r>
-      <w:r>
-        <w:t xml:space="preserve"> fuel, and contributing to rising air pollution.</w:t>
-      </w:r>
-    </w:p>
-    <w:p/>
-    <w:p>
-      <w:r>
-        <w:t xml:space="preserve">Congestion can also take an economic toll. Congested roads </w:t>
-      </w:r>
-      <w:r>
-        <w:t>lead</w:t>
-      </w:r>
-      <w:r>
-        <w:t xml:space="preserve"> to higher stress and </w:t>
-      </w:r>
-      <w:r>
-        <w:t>frustration</w:t>
-      </w:r>
-      <w:r>
-        <w:t xml:space="preserve">, </w:t>
-      </w:r>
-      <w:r>
-        <w:t>raising</w:t>
-      </w:r>
-      <w:r>
-        <w:t xml:space="preserve"> the </w:t>
-      </w:r>
-      <w:r>
-        <w:t>likelihood</w:t>
-      </w:r>
-      <w:r>
-        <w:t xml:space="preserve"> of accidents, and </w:t>
-      </w:r>
-      <w:r>
-        <w:t>discouraging</w:t>
-      </w:r>
-      <w:r>
-        <w:t xml:space="preserve"> people from traveling altogether. Research</w:t>
-      </w:r>
-      <w:r>
-        <w:t>ers</w:t>
+      <w:bookmarkStart w:id="2" w:name="_Toc243679926"/>
+      <w:r>
+        <w:t>Real World Troubles</w:t>
+      </w:r>
+      <w:bookmarkEnd w:id="2"/>
+    </w:p>
+    <w:p>
+      <w:r>
+        <w:t xml:space="preserve">Traffic congestion of one of the most widespread problems in urban life, influencing city residents every day. Drivers lose significant time each year sitting in traffic, burning up fuel, and contributing to rising air pollution. Congestion can also take an economic toll. Congested roads lead to higher stress and frustration, raising the likelihood of accidents, and discouraging people from traveling altogether. Researchers have noted that traffic congestion cause large cities to deliver less than they should </w:t>
+      </w:r>
+      <w:proofErr w:type="spellStart"/>
+      <w:r>
+        <w:t>given</w:t>
+      </w:r>
+      <w:proofErr w:type="spellEnd"/>
+      <w:r>
+        <w:t xml:space="preserve"> their size and resources </w:t>
+      </w:r>
+      <w:r>
+        <w:t>(Andrew, 2025)</w:t>
+      </w:r>
+      <w:r>
+        <w:t>.</w:t>
+      </w:r>
+    </w:p>
+    <w:p/>
+    <w:p>
+      <w:r>
+        <w:t xml:space="preserve">Intersections are one of the most dangerous points in any road network. Traffic fatalities involving an intersection took up 28% of all traffic fatalities in 2022 </w:t>
+      </w:r>
+      <w:r>
+        <w:t>(Federal Highway Administration, 2</w:t>
+      </w:r>
+      <w:r>
+        <w:t>026). Four-way intersections are the most common place for deadly collisions, accounting for nearly 62% of all intersection related fatal crashes, this goes beyond drivers, 26% of pedestrian fatalities and 40% of cyclist fatalities in 2018 happened at intersections. Intersection design has a direct impact on public safety. Signal time, lane configuration, and turn sequences are all part of a system that determines when and if people go home. A simulation tool that allows engineers to test these design choices before construction would play a role in reducing these statistics.</w:t>
+      </w:r>
+    </w:p>
+    <w:p/>
+    <w:p>
+      <w:r>
+        <w:t xml:space="preserve">Infrastructure has vastly changed to accommodate dense population and destinations. Modern intersections are hardly uniform, varying in geometry, visibility, and traffic density. Traffic complexity is measured by combing static geometry such as number of approach legs, road width, sight distance, and presence of islands or medians. With dynamic environments such as traffic volume, pedestrian crossing, and bicycle lanes. More complexity of intersections has shown an increase in the mental workload of drivers </w:t>
+      </w:r>
+      <w:r>
+        <w:t xml:space="preserve">(Hannes </w:t>
+      </w:r>
+      <w:proofErr w:type="spellStart"/>
+      <w:r>
+        <w:t>Weinreuter</w:t>
+      </w:r>
+      <w:proofErr w:type="spellEnd"/>
+      <w:r>
+        <w:t xml:space="preserve"> et al., 2022)</w:t>
+      </w:r>
+      <w:r>
+        <w:t xml:space="preserve">. </w:t>
+      </w:r>
+    </w:p>
+    <w:p/>
+    <w:p>
+      <w:pPr>
+        <w:pStyle w:val="Heading2"/>
+      </w:pPr>
+      <w:bookmarkStart w:id="3" w:name="_Toc243679927"/>
+      <w:r>
+        <w:t>Modern tools with flaws</w:t>
+      </w:r>
+      <w:bookmarkEnd w:id="3"/>
+    </w:p>
+    <w:p>
+      <w:r>
+        <w:t>There are many traffic simulation programs used for transportation. PTV Vissim and Aimsun Next are two leading simulators, which model the movement of vehicles and pedestrians in a road network. These have proven to be powerful tools, but they are very expensive.</w:t>
       </w:r>
       <w:r>
         <w:t xml:space="preserve"> </w:t>
       </w:r>
       <w:r>
-        <w:t>have</w:t>
-      </w:r>
-      <w:r>
-        <w:t xml:space="preserve"> noted that traffic congestion </w:t>
-      </w:r>
-      <w:r>
-        <w:t>cause</w:t>
+        <w:t xml:space="preserve">Aimsun’s most basic </w:t>
+      </w:r>
+      <w:r>
+        <w:t xml:space="preserve">“lite” </w:t>
+      </w:r>
+      <w:r>
+        <w:t xml:space="preserve">model is </w:t>
+      </w:r>
+      <w:r>
+        <w:t>€2,000</w:t>
+      </w:r>
+      <w:r>
+        <w:t xml:space="preserve"> ($2,244.60)</w:t>
+      </w:r>
+      <w:r>
+        <w:t xml:space="preserve"> / year</w:t>
       </w:r>
       <w:r>
         <w:t xml:space="preserve"> </w:t>
       </w:r>
       <w:r>
+        <w:t>and</w:t>
+      </w:r>
+      <w:r>
+        <w:t xml:space="preserve"> limited to 20 </w:t>
+      </w:r>
+      <w:r>
+        <w:lastRenderedPageBreak/>
+        <w:t>intersections</w:t>
+      </w:r>
+      <w:r>
+        <w:t xml:space="preserve">, while PTV Vissim’s pricing is only </w:t>
+      </w:r>
+      <w:r>
+        <w:t>available</w:t>
+      </w:r>
+      <w:r>
+        <w:t xml:space="preserve"> upon request</w:t>
+      </w:r>
+      <w:r>
+        <w:t>, but price goes up as you add more junctions and modules</w:t>
+      </w:r>
+      <w:r>
+        <w:t>.</w:t>
+      </w:r>
+    </w:p>
+    <w:p/>
+    <w:p>
+      <w:r>
+        <w:t xml:space="preserve">These programs are built for </w:t>
+      </w:r>
+      <w:r>
+        <w:t>experts</w:t>
+      </w:r>
+      <w:r>
+        <w:t xml:space="preserve"> in their field, with even a simple </w:t>
+      </w:r>
+      <w:r>
+        <w:t>project that</w:t>
+      </w:r>
+      <w:r>
+        <w:t xml:space="preserve"> takes a lot of effort. The Federal Highway Administration </w:t>
+      </w:r>
+      <w:r>
+        <w:t>warns</w:t>
+      </w:r>
+      <w:r>
+        <w:t xml:space="preserve"> that microsimulation can be “time-consuming and resource-intensive </w:t>
+      </w:r>
+      <w:r>
+        <w:t>activity</w:t>
+      </w:r>
+      <w:r>
+        <w:t>” (Dowling et al. 2004).</w:t>
+      </w:r>
+      <w:r>
+        <w:t xml:space="preserve"> Models need huge amounts of data and must be calibrated before results become viable. The PTV group suggests a </w:t>
+      </w:r>
+      <w:r>
+        <w:t>16-hour</w:t>
+      </w:r>
+      <w:r>
+        <w:t xml:space="preserve"> course just to learn the basics of using their software </w:t>
+      </w:r>
+      <w:r>
+        <w:t xml:space="preserve">(PTV Planung Transport Verkehr GmbH, </w:t>
+      </w:r>
+      <w:r>
+        <w:t>2026</w:t>
+      </w:r>
+      <w:r>
+        <w:t>)</w:t>
+      </w:r>
+      <w:r>
+        <w:t>.</w:t>
+      </w:r>
+    </w:p>
+    <w:p>
+      <w:r>
+        <w:t>Git l</w:t>
+      </w:r>
+    </w:p>
+    <w:p>
+      <w:r>
+        <w:t>The software is priced for large networks, which is excessive when covering one intersection. Engineers could spend weeks before seeing results with the long setup, discouraging designing early in a project.</w:t>
+      </w:r>
+      <w:r>
+        <w:t xml:space="preserve"> A simpler program, having a much smaller focus, where users can design, run, and compare results</w:t>
+      </w:r>
+      <w:r>
+        <w:t xml:space="preserve"> would solve the </w:t>
+      </w:r>
+      <w:r>
         <w:t>large</w:t>
       </w:r>
       <w:r>
-        <w:t xml:space="preserve"> cities </w:t>
-      </w:r>
-      <w:r>
-        <w:t>to deliver</w:t>
-      </w:r>
-      <w:r>
-        <w:t xml:space="preserve"> less </w:t>
-      </w:r>
-      <w:r>
-        <w:t>than</w:t>
-      </w:r>
-      <w:r>
-        <w:t xml:space="preserve"> they should give</w:t>
-      </w:r>
-      <w:r>
-        <w:t>n</w:t>
-      </w:r>
-      <w:r>
-        <w:t xml:space="preserve"> their size and resources </w:t>
-      </w:r>
-      <w:r>
-        <w:t>(Andrew, 2025)</w:t>
-      </w:r>
-      <w:r>
-        <w:t>.</w:t>
-      </w:r>
-    </w:p>
-    <w:p/>
-    <w:p>
-      <w:pPr>
-        <w:pStyle w:val="Heading3"/>
-      </w:pPr>
-      <w:r>
-        <w:t>Traffic Accidents Related to Intersections</w:t>
-      </w:r>
-    </w:p>
-    <w:p>
-      <w:r>
-        <w:t>Intersections</w:t>
-      </w:r>
-      <w:r>
-        <w:t xml:space="preserve"> are one of the most </w:t>
-      </w:r>
-      <w:r>
-        <w:t>dangerous</w:t>
-      </w:r>
-      <w:r>
-        <w:t xml:space="preserve"> points in any </w:t>
-      </w:r>
-      <w:r>
-        <w:t>road network</w:t>
-      </w:r>
-      <w:r>
-        <w:t xml:space="preserve">. </w:t>
-      </w:r>
-      <w:r>
-        <w:t xml:space="preserve">Traffic fatalities involving an intersection took up 28% of all traffic fatalities in 2022 </w:t>
-      </w:r>
-      <w:r>
-        <w:t>(Federal Highway Administration, 2</w:t>
-      </w:r>
-      <w:r>
-        <w:t xml:space="preserve">026). </w:t>
-      </w:r>
-      <w:r>
-        <w:t xml:space="preserve">Four-way </w:t>
-      </w:r>
-      <w:r>
-        <w:t>intersections</w:t>
-      </w:r>
-      <w:r>
-        <w:t xml:space="preserve"> are the most common place for deadly </w:t>
-      </w:r>
-      <w:r>
-        <w:t>collisions</w:t>
-      </w:r>
-      <w:r>
-        <w:t xml:space="preserve">, accounting for nearly 62% of all intersection related fatal crashes, this goes beyond drivers, 26% of pedestrian fatalities and 40% of cyclist </w:t>
-      </w:r>
-      <w:r>
-        <w:t>fatalities</w:t>
-      </w:r>
-      <w:r>
-        <w:t xml:space="preserve"> in 2018 happened at intersections.</w:t>
-      </w:r>
-    </w:p>
-    <w:p/>
-    <w:p>
-      <w:r>
-        <w:t>Intersection design has a direct impact on public safety. Signal time, lane configuration, and turn sequences are all part of a system that determines when and if people go home. A simulation tool that allows engineers to test these design choices before construction would play a role in reducing these statistics.</w:t>
-      </w:r>
-    </w:p>
-    <w:p/>
-    <w:p>
-      <w:pPr>
-        <w:pStyle w:val="Heading3"/>
-      </w:pPr>
-      <w:r>
-        <w:t>Complexity of Modern Intersections</w:t>
-      </w:r>
-    </w:p>
-    <w:p>
-      <w:r>
-        <w:t>Infrastructure has vastly changed to accommodate dense population and destinations. Modern intersections are hardly uniform, varying in geometry, visibility, and traffic density.</w:t>
-      </w:r>
-      <w:r>
-        <w:t xml:space="preserve"> </w:t>
-      </w:r>
-      <w:r>
-        <w:t xml:space="preserve">Traffic complexity is measured by combing static geometry such as number of approach legs, road width, sight distance, and presence of islands or medians. With dynamic environments such as traffic volume, pedestrian crossing, and bicycle lanes. </w:t>
-      </w:r>
-      <w:r>
-        <w:t xml:space="preserve">More </w:t>
-      </w:r>
-      <w:r>
-        <w:lastRenderedPageBreak/>
-        <w:t xml:space="preserve">complexity of intersections has shown an increase in the mental workload of </w:t>
-      </w:r>
-      <w:r>
-        <w:t xml:space="preserve">drivers </w:t>
-      </w:r>
-      <w:r>
-        <w:t>(Hannes Weinreuter et al., 2022)</w:t>
-      </w:r>
-      <w:r>
-        <w:t>.</w:t>
-      </w:r>
-      <w:r>
-        <w:t xml:space="preserve"> </w:t>
-      </w:r>
-    </w:p>
-    <w:p/>
-    <w:p>
-      <w:r>
-        <w:t>Modern tools with flaws</w:t>
-      </w:r>
+        <w:t xml:space="preserve"> cost and learning </w:t>
+      </w:r>
+      <w:r>
+        <w:t>curve</w:t>
+      </w:r>
+      <w:r>
+        <w:t xml:space="preserve">. Becoming a practical </w:t>
+      </w:r>
+      <w:r>
+        <w:t>and affordable traffic simulator for more people.</w:t>
+      </w:r>
+    </w:p>
+    <w:p/>
+    <w:p>
+      <w:pPr>
+        <w:pStyle w:val="Heading2"/>
+      </w:pPr>
+      <w:bookmarkStart w:id="4" w:name="_Toc243679928"/>
+      <w:r>
+        <w:t>The Who</w:t>
+      </w:r>
+      <w:bookmarkEnd w:id="4"/>
     </w:p>
     <w:p>
       <w:pPr>
@@ -353,7 +328,7 @@
         </w:numPr>
       </w:pPr>
       <w:r>
-        <w:t>Available commercial software</w:t>
+        <w:t>Good software not available to the public</w:t>
       </w:r>
     </w:p>
     <w:p>
@@ -365,7 +340,7 @@
         </w:numPr>
       </w:pPr>
       <w:r>
-        <w:t>Complexity</w:t>
+        <w:t>Students lack hands on tools</w:t>
       </w:r>
     </w:p>
     <w:p>
@@ -377,73 +352,43 @@
         </w:numPr>
       </w:pPr>
       <w:r>
-        <w:t>Drawbacks</w:t>
-      </w:r>
-    </w:p>
-    <w:p>
-      <w:r>
-        <w:t>The who</w:t>
+        <w:t>Results understood by engineers and businessmen</w:t>
       </w:r>
     </w:p>
     <w:p>
       <w:pPr>
         <w:pStyle w:val="ListParagraph"/>
-        <w:numPr>
-          <w:ilvl w:val="0"/>
-          <w:numId w:val="1"/>
-        </w:numPr>
-      </w:pPr>
-      <w:r>
-        <w:t>Good software not available to the public</w:t>
-      </w:r>
+      </w:pPr>
     </w:p>
     <w:p>
       <w:pPr>
         <w:pStyle w:val="ListParagraph"/>
-        <w:numPr>
-          <w:ilvl w:val="0"/>
-          <w:numId w:val="1"/>
-        </w:numPr>
-      </w:pPr>
-      <w:r>
-        <w:t>Students lack hands on tools</w:t>
-      </w:r>
-    </w:p>
-    <w:p>
-      <w:pPr>
-        <w:pStyle w:val="ListParagraph"/>
-        <w:numPr>
-          <w:ilvl w:val="0"/>
-          <w:numId w:val="1"/>
-        </w:numPr>
-      </w:pPr>
-      <w:r>
-        <w:t>Results understood by engineers and businessmen</w:t>
-      </w:r>
-    </w:p>
-    <w:p>
-      <w:pPr>
-        <w:pStyle w:val="ListParagraph"/>
-      </w:pPr>
-    </w:p>
-    <w:p>
-      <w:pPr>
-        <w:pStyle w:val="ListParagraph"/>
-      </w:pPr>
+      </w:pPr>
+    </w:p>
+    <w:p>
+      <w:pPr>
+        <w:rPr>
+          <w:rFonts w:asciiTheme="majorHAnsi" w:eastAsiaTheme="majorEastAsia" w:hAnsiTheme="majorHAnsi" w:cstheme="majorBidi"/>
+          <w:b/>
+          <w:color w:val="000000" w:themeColor="text1"/>
+          <w:sz w:val="32"/>
+          <w:szCs w:val="40"/>
+        </w:rPr>
+      </w:pPr>
+      <w:r>
+        <w:br w:type="page"/>
+      </w:r>
     </w:p>
     <w:p>
       <w:pPr>
         <w:pStyle w:val="Heading1"/>
       </w:pPr>
       <w:r>
+        <w:lastRenderedPageBreak/>
         <w:t>References</w:t>
       </w:r>
     </w:p>
-    <w:p>
-      <w:r>
-        <w:t>123</w:t>
-      </w:r>
-    </w:p>
+    <w:p/>
     <w:p>
       <w:hyperlink r:id="rId6" w:history="1">
         <w:r>
@@ -474,6 +419,29 @@
         </w:r>
       </w:hyperlink>
     </w:p>
+    <w:p/>
+    <w:p>
+      <w:hyperlink r:id="rId9" w:history="1">
+        <w:r>
+          <w:rPr>
+            <w:rStyle w:val="Hyperlink"/>
+          </w:rPr>
+          <w:t>https://ops.fhwa.dot.gov/trafficanalysistools/tat_vol3/sect0.htm</w:t>
+        </w:r>
+      </w:hyperlink>
+    </w:p>
+    <w:p>
+      <w:hyperlink r:id="rId10" w:history="1">
+        <w:r>
+          <w:rPr>
+            <w:rStyle w:val="Hyperlink"/>
+          </w:rPr>
+          <w:t>https://training.ptvgroup.com/de/courses/tr-t0251</w:t>
+        </w:r>
+      </w:hyperlink>
+    </w:p>
+    <w:p/>
+    <w:p/>
     <w:p/>
     <w:sectPr>
       <w:pgSz w:w="12240" w:h="15840"/>
@@ -1209,7 +1177,6 @@
   <w:style w:type="character" w:default="1" w:styleId="DefaultParagraphFont">
     <w:name w:val="Default Paragraph Font"/>
     <w:uiPriority w:val="1"/>
-    <w:semiHidden/>
     <w:unhideWhenUsed/>
   </w:style>
   <w:style w:type="table" w:default="1" w:styleId="TableNormal">

</xml_diff>